<commit_message>
feat(core): implement transactional outbox, atomic DAG fan-in, and schedule deduplication
</commit_message>
<xml_diff>
--- a/docs/Pulse-Technical-Documentation.docx
+++ b/docs/Pulse-Technical-Documentation.docx
@@ -8023,6 +8023,123 @@
     <w:p>
       <w:r>
         <w:t>The webhook test suite (frontend/e2e/webhooks.spec.ts) verifies endpoint registration, event filtering, signing secret masking and revealing (whsec_...), live test ping execution, and delivery audit log inspection in the slide-out drawer.</w:t>
+      </w:r>
+    </w:p>
+    <w:p>
+      <w:pPr>
+        <w:pStyle w:val="Heading1"/>
+      </w:pPr>
+      <w:r>
+        <w:t>14. Webhook Signing Secret Security, KMS Encryption, &amp; RBAC Hardening</w:t>
+      </w:r>
+    </w:p>
+    <w:p>
+      <w:r>
+        <w:t>Pulse hardens outbound webhook delivery security, secret lifecycles, and tenant boundaries. Signing secrets are separated from read schemas, encrypted at rest using AES-128 KMS abstraction, rotated non-destructively with dual-signing grace periods, and sanitized from delivery payloads.</w:t>
+      </w:r>
+    </w:p>
+    <w:p>
+      <w:pPr>
+        <w:pStyle w:val="Heading2"/>
+      </w:pPr>
+      <w:r>
+        <w:t>14.1 Schema Separation &amp; Raw Secret Non-Exposure</w:t>
+      </w:r>
+    </w:p>
+    <w:p>
+      <w:r>
+        <w:t>The webhook subscription schemas are partitioned into WebhookSubscriptionCreateOut, WebhookSecretRotateOut, and WebhookSubscriptionOut. Raw signing secrets are returned strictly once upon creation or rotation; list and get endpoints omit the raw secret and display only masked previews (whsec_••••••••••••••••).</w:t>
+      </w:r>
+    </w:p>
+    <w:p>
+      <w:pPr>
+        <w:pStyle w:val="Heading2"/>
+      </w:pPr>
+      <w:r>
+        <w:t>14.2 KMS Encryption at Rest &amp; Transparent Migration</w:t>
+      </w:r>
+    </w:p>
+    <w:p>
+      <w:r>
+        <w:t>All webhook signing secrets persisted in PostgreSQL are encrypted at rest using Fernet authenticated encryption (AES-128-CBC + HMAC-SHA256) with enc:v1: prefixes. The encryption key is derived from WEBHOOK_ENCRYPTION_KEY or settings.SECRET_KEY. Legacy unencrypted rows decrypt transparently for zero downtime.</w:t>
+      </w:r>
+    </w:p>
+    <w:p>
+      <w:pPr>
+        <w:pStyle w:val="Heading2"/>
+      </w:pPr>
+      <w:r>
+        <w:t>14.3 Non-Destructive Secret Rotation with Dual-Signing Grace Windows</w:t>
+      </w:r>
+    </w:p>
+    <w:p>
+      <w:r>
+        <w:t>Secret rotation retains the previous secret and sets a configurable grace window (previous_secret_expires_at). Outbound webhook deliveries during the window sign payloads with both active and previous secrets (X-Pulse-Signature and X-Pulse-Signature-Previous), preventing delivery packet drops during consumer credential rotation.</w:t>
+      </w:r>
+    </w:p>
+    <w:p>
+      <w:pPr>
+        <w:pStyle w:val="Heading2"/>
+      </w:pPr>
+      <w:r>
+        <w:t>14.4 Delivery Payload Sanitization &amp; Org-Admin RBAC Boundary</w:t>
+      </w:r>
+    </w:p>
+    <w:p>
+      <w:r>
+        <w:t>Webhook creation, update, rotation, deletion, and delivery log inspection are restricted to OrgAdmin and SystemAdmin roles. Delivery payloads and response bodies are automatically sanitized to redact passwords, tokens, API keys, Bearer headers, and database connection strings.</w:t>
+      </w:r>
+    </w:p>
+    <w:p>
+      <w:pPr>
+        <w:pStyle w:val="Heading1"/>
+      </w:pPr>
+      <w:r>
+        <w:t>15. Transactional Outbox Pattern, Atomic DAG Fan-In, &amp; Schedule Deduplication</w:t>
+      </w:r>
+    </w:p>
+    <w:p>
+      <w:r>
+        <w:t>Pulse guarantees durable, race-free state transitions and eliminates internal duplicate dispatch under concurrency through a PostgreSQL Transactional Outbox table (outbox_events), atomic conditional DAG join resolution, and database-level cron occurrence deduplication.</w:t>
+      </w:r>
+    </w:p>
+    <w:p>
+      <w:pPr>
+        <w:pStyle w:val="Heading2"/>
+      </w:pPr>
+      <w:r>
+        <w:t>15.1 Transactional Outbox Architecture &amp; Idempotent Publisher</w:t>
+      </w:r>
+    </w:p>
+    <w:p>
+      <w:r>
+        <w:t>State transitions that trigger Celery work, real-time SSE broadcasts, or outbound webhooks record immutable OutboxEvent rows within the exact same database transaction as application state. Publication only occurs after commit. A background Celery Beat publisher task (process_outbox_events) claims pending events using row-level locking (SELECT ... FOR UPDATE SKIP LOCKED), handling worker crashes and retries idempotently with bounded retries (MAX_OUTBOX_RETRIES = 5).</w:t>
+      </w:r>
+    </w:p>
+    <w:p>
+      <w:pPr>
+        <w:pStyle w:val="Heading2"/>
+      </w:pPr>
+      <w:r>
+        <w:t>15.2 Atomic DAG Fan-In Join Resolution</w:t>
+      </w:r>
+    </w:p>
+    <w:p>
+      <w:r>
+        <w:t>In multi-parent DAG diamond workflows where multiple prerequisite parents finish concurrently, join completion is evaluated atomically at the database boundary via a conditional update: UPDATE jobs SET status = 'QUEUED' WHERE id = :id AND status = 'BLOCKED'. Exactly one winning worker thread receives rowcount == 1 and creates the dispatch event; losing threads safely skip dispatch, eliminating duplicate child executions.</w:t>
+      </w:r>
+    </w:p>
+    <w:p>
+      <w:pPr>
+        <w:pStyle w:val="Heading2"/>
+      </w:pPr>
+      <w:r>
+        <w:t>15.3 Hardened Schedule Deduplication &amp; Safe Lua Lock Release</w:t>
+      </w:r>
+    </w:p>
+    <w:p>
+      <w:r>
+        <w:t>Recurring cron schedules validate expressions on write using croniter with strict UTC normalization. The scheduler evaluates schedules under an owned Redis lock with random UUID tokens and atomic Lua compare-and-delete, preventing stale runners from deleting subsequent locks. Each scheduled fire time persists a unique ScheduleOccurrence row keyed by (schedule_id, scheduled_fire_time) prior to job creation, guaranteeing exactly-one dispatch per fire tick.</w:t>
       </w:r>
     </w:p>
     <w:sectPr>

</xml_diff>

<commit_message>
feat(security): harden network topology, proxy identity, SSE connection tickets, and SSRF transport
</commit_message>
<xml_diff>
--- a/docs/Pulse-Technical-Documentation.docx
+++ b/docs/Pulse-Technical-Documentation.docx
@@ -8140,6 +8140,71 @@
     <w:p>
       <w:r>
         <w:t>Recurring cron schedules validate expressions on write using croniter with strict UTC normalization. The scheduler evaluates schedules under an owned Redis lock with random UUID tokens and atomic Lua compare-and-delete, preventing stale runners from deleting subsequent locks. Each scheduled fire time persists a unique ScheduleOccurrence row keyed by (schedule_id, scheduled_fire_time) prior to job creation, guaranteeing exactly-one dispatch per fire tick.</w:t>
+      </w:r>
+    </w:p>
+    <w:p>
+      <w:pPr>
+        <w:pStyle w:val="Heading1"/>
+      </w:pPr>
+      <w:r>
+        <w:t>16. Network and Session Security Hardening, SSE Connection Tickets, &amp; Defense-in-Depth SSRF</w:t>
+      </w:r>
+    </w:p>
+    <w:p>
+      <w:r>
+        <w:t>Pulse implements comprehensive network and session security defenses across browser, API, worker transport, and monitoring ingress boundaries to prevent token leakage, IP spoofing, SSRF bypasses, and unauthorized metric exposition.</w:t>
+      </w:r>
+    </w:p>
+    <w:p>
+      <w:pPr>
+        <w:pStyle w:val="Heading2"/>
+      </w:pPr>
+      <w:r>
+        <w:t>16.1 Query-String JWT Removal &amp; Single-Use SSE Connection Tickets</w:t>
+      </w:r>
+    </w:p>
+    <w:p>
+      <w:r>
+        <w:t>Query-string authentication (?token=...) has been strictly eliminated from all general REST APIs and GET /events. Authenticated endpoints exclusively verify pulse_access_token httpOnly cookies. For environments or non-browser consumers requiring Server-Sent Events (SSE) where custom cookie headers cannot be transmitted via native EventSource, the API introduces POST /auth/sse-ticket. The endpoint issues a single-use connection ticket (sset_...) valid for 60 seconds. Upon connecting to GET /events?ticket=sset_..., the backend atomically reads and destroys the ticket via Redis GETDEL (with in-memory fallback), preventing query-string token persistence in proxy logs or browser history.</w:t>
+      </w:r>
+    </w:p>
+    <w:p>
+      <w:pPr>
+        <w:pStyle w:val="Heading2"/>
+      </w:pPr>
+      <w:r>
+        <w:t>16.2 Client IP Identification &amp; Trusted Reverse Proxy Topology</w:t>
+      </w:r>
+    </w:p>
+    <w:p>
+      <w:r>
+        <w:t>The rate limiter and audit logging systems evaluate client IP addresses with strict reverse-proxy trust validation. X-Forwarded-For and X-Real-IP headers are parsed only when the direct socket TCP peer matches the configured TRUSTED_PROXIES allowlist (e.g. Kubernetes ingress controllers or load balancers). If connecting directly or through an untrusted intermediary, header spoofing is ignored and the socket peer IP is used. Furthermore, sensitive authentication endpoints (/auth/login, /auth/register, /auth/accept-invite) utilize fail-closed rate limiting (fail_closed=True) returning 503 Service Unavailable upon Redis outage, preventing brute-force attacks during security monitoring disruptions.</w:t>
+      </w:r>
+    </w:p>
+    <w:p>
+      <w:pPr>
+        <w:pStyle w:val="Heading2"/>
+      </w:pPr>
+      <w:r>
+        <w:t>16.3 Defense-in-Depth SSRF HTTP Client Transport</w:t>
+      </w:r>
+    </w:p>
+    <w:p>
+      <w:r>
+        <w:t>Pulse replaces naive pre-flight DNS lookups with an integrated, defense-in-depth HTTP transport client (execute_safe_http_request). It resolves all candidate IPv4 and IPv6 addresses, blocking private RFC 1918 networks, loopback addresses (127.0.0.0/8, ::1), link-local and cloud metadata endpoints (169.254.169.254, fd00:ec2::254, 100.100.100.200), multicast, and IPv4-mapped IPv6 embeddings (::ffff:127.0.0.1). Redirects are strictly disabled (follow_redirects=False) on outbound webhook deliveries and HTTP jobs to eliminate redirect-based SSRF bypasses. The client enforces bounded connect (5s), read (10s), write (5s), and pool (5s) timeouts, and bounds response payloads to 1MB.</w:t>
+      </w:r>
+    </w:p>
+    <w:p>
+      <w:pPr>
+        <w:pStyle w:val="Heading2"/>
+      </w:pPr>
+      <w:r>
+        <w:t>16.4 Browser/API Topology, CSRF Protection Middleware, &amp; Metrics Isolation</w:t>
+      </w:r>
+    </w:p>
+    <w:p>
+      <w:r>
+        <w:t>The production browser topology establishes same-origin proxying via Next.js rewrites() (/api/:path* -&gt; FastAPI backend). Cross-origin browser requests are protected by CSRFProtectionMiddleware, intercepting all state-modifying HTTP methods (POST, PUT, PATCH, DELETE) carrying browser cookie authentication and verifying Origin and Referer headers against CORS_ORIGINS. The Prometheus telemetry endpoint (GET /metrics) is isolated from public exposition, supporting private network verification (METRICS_PROTECT) and Bearer token authorization (METRICS_TOKEN).</w:t>
       </w:r>
     </w:p>
     <w:sectPr>

</xml_diff>

<commit_message>
feat(integrity): harden data bounds, retry tenant isolation, alembic migrations, and prod deployment topology
</commit_message>
<xml_diff>
--- a/docs/Pulse-Technical-Documentation.docx
+++ b/docs/Pulse-Technical-Documentation.docx
@@ -8205,6 +8205,109 @@
     <w:p>
       <w:r>
         <w:t>The production browser topology establishes same-origin proxying via Next.js rewrites() (/api/:path* -&gt; FastAPI backend). Cross-origin browser requests are protected by CSRFProtectionMiddleware, intercepting all state-modifying HTTP methods (POST, PUT, PATCH, DELETE) carrying browser cookie authentication and verifying Origin and Referer headers against CORS_ORIGINS. The Prometheus telemetry endpoint (GET /metrics) is isolated from public exposition, supporting private network verification (METRICS_PROTECT) and Bearer token authorization (METRICS_TOKEN).</w:t>
+      </w:r>
+    </w:p>
+    <w:p>
+      <w:pPr>
+        <w:pStyle w:val="Heading1"/>
+      </w:pPr>
+      <w:r>
+        <w:t>17. Data Integrity Boundaries, Multi-Tenant Queue Isolation, Named Migration Constraints, and Segmented Production Deployment Topology</w:t>
+      </w:r>
+    </w:p>
+    <w:p>
+      <w:pPr>
+        <w:pStyle w:val="Heading2"/>
+      </w:pPr>
+      <w:r>
+        <w:t>17.1 Cross-Tenant Retry Policy Ownership Validation</w:t>
+      </w:r>
+    </w:p>
+    <w:p>
+      <w:r>
+        <w:t>To eliminate multi-tenant resource leakage, Pulse enforces queue-level ownership checks across job creation endpoints (POST /projects/{project_id}/queues/{queue_id}/jobs and .../jobs/batch). If a request supplies a retry_policy_id, the API verifies that RetryPolicy.id == payload.retry_policy_id and RetryPolicy.queue_id == queue.id. Attempts by an authenticated tenant to bind a retry policy belonging to another queue or organization are rejected with HTTP 400 Bad Request ('Retry policy not found or does not belong to this queue'). This guarantees that tenants cannot read, infer, or reuse backoff policies belonging to other tenants.</w:t>
+      </w:r>
+    </w:p>
+    <w:p>
+      <w:pPr>
+        <w:pStyle w:val="Heading2"/>
+      </w:pPr>
+      <w:r>
+        <w:t>17.2 Request Boundary Bounds, Payload Caps &amp; Keyset Cursor Pagination</w:t>
+      </w:r>
+    </w:p>
+    <w:p>
+      <w:r>
+        <w:t>To protect database memory, WAL write buffers, and network interfaces against denial-of-service vectors, Pulse enforces strict Pydantic payload boundaries:</w:t>
+        <w:br/>
+        <w:t>• Job Payload Size: Capped at 256 KB serialized JSON (MAX_JOB_PAYLOAD_BYTES = 262,144 bytes).</w:t>
+        <w:br/>
+        <w:t>• HTTP Job Payloads: Target URLs are bounded to 2,048 characters; custom headers are limited to 50 entries (max 128 key / 2,048 value characters); bodies are capped at 256 KB.</w:t>
+        <w:br/>
+        <w:t>• Batch Limits: Job batch submissions (JobBatchCreate.jobs) are capped at a maximum of 100 jobs per request.</w:t>
+        <w:br/>
+        <w:t>• Entity Identifiers: Project, Queue, Schedule, and Webhook Subscription names are bounded to 120 characters.</w:t>
+        <w:br/>
+        <w:br/>
+        <w:t>To eliminate quadratic query performance degradation caused by high-offset pagination (OFFSET N LIMIT M), Pulse implements timestamp-based keyset cursor pagination across GET /projects/{project_id}/queues/{queue_id}/jobs and GET /audit-logs. Clients supply ?cursor=&lt;ISO-8601-timestamp&gt;&amp;limit=&lt;1..100&gt;. The server queries limit + 1 records to evaluate whether subsequent pages exist without running expensive COUNT(*) table scans, returning X-Has-More: true|false and X-Next-Cursor in response headers (exposed to browser clients via CORS headers).</w:t>
+        <w:br/>
+        <w:br/>
+        <w:t>Compound database indexes support constant-time pagination: ix_jobs_queue_created (queue_id, created_at DESC), ix_jobs_status_created (status, created_at DESC), ix_audit_logs_org_created (org_id, created_at DESC), and ix_webhook_deliveries_sub_delivered (subscription_id, delivered_at DESC).</w:t>
+      </w:r>
+    </w:p>
+    <w:p>
+      <w:pPr>
+        <w:pStyle w:val="Heading2"/>
+      </w:pPr>
+      <w:r>
+        <w:t>17.3 Named Alembic Migration Constraints &amp; Multi-Dialect Round-Trip Testing</w:t>
+      </w:r>
+    </w:p>
+    <w:p>
+      <w:r>
+        <w:t>Database migrations must be fully deterministic and reversible. Pulse hardens Alembic migration history by:</w:t>
+        <w:br/>
+        <w:t>• Explicit Foreign Key Naming: All foreign key constraints (e.g. fk_jobs_depends_on_job_id in migration 3d5fb332397d) are explicitly named in both create_foreign_key and drop_constraint statements, preventing constraint lookup failures during downgrades across PostgreSQL and SQLite batch engines.</w:t>
+        <w:br/>
+        <w:t>• Dialect Guards: Postgres-specific DDL operations (ALTER TYPE jobstatus ADD VALUE, gen_random_uuid(), native enums) are guarded behind dialect checks (bind.dialect.name == 'postgresql'), allowing migrations to run cleanly in development, in-memory SQLite test runners, and production clusters.</w:t>
+        <w:br/>
+        <w:t>• Automated Round-Trip Testing: An automated integration test (test_alembic_migration_round_trip) and GitHub Actions CI step execute upgrade head -&gt; downgrade base -&gt; upgrade head against PostgreSQL 16 on every commit.</w:t>
+      </w:r>
+    </w:p>
+    <w:p>
+      <w:pPr>
+        <w:pStyle w:val="Heading2"/>
+      </w:pPr>
+      <w:r>
+        <w:t>17.4 Segmented Production Deployment Topology (docker-compose.prod.yml)</w:t>
+      </w:r>
+    </w:p>
+    <w:p>
+      <w:r>
+        <w:t>Pulse provides a hardened, zero-trust production deployment configuration (docker-compose.prod.yml and .env.production.example):</w:t>
+        <w:br/>
+        <w:t>• Network Segmentation: Internal storage services (PostgreSQL 16, Redis 7, Celery worker fleets, Beat scheduler, and migration) reside exclusively on the private pulse-internal bridge network (internal: true) with zero exposed host ports. The API and Frontend reside on pulse-ingress, bound strictly to 127.0.0.1 (ports 8000 and 3000) for reverse proxy and TLS termination.</w:t>
+        <w:br/>
+        <w:t>• Secret Injection &amp; Startup Validation: Development default secrets (dev-secret-change-me) are strictly rejected in production (IS_DEV=false). Required settings (SECRET_KEY, WEBHOOK_ENCRYPTION_KEY, POSTGRES_PASSWORD, REDIS_PASSWORD, METRICS_TOKEN) must be supplied via environment variables.</w:t>
+        <w:br/>
+        <w:t>• Redis Password Authentication: Redis runs with requirepass enabled and append-only persistence (AOF).</w:t>
+        <w:br/>
+        <w:t>• One-Off Migration Gate: A dedicated migration container runs alembic upgrade head prior to API and worker startup; services enforce depends_on: migration: condition: service_completed_successfully.</w:t>
+        <w:br/>
+        <w:t>• Container Hardening: Multi-stage Docker builds, unprivileged system users (UID 10001 for Python, UID 1001 for Node.js), no-new-privileges security flags, immutable runtimes without source bind mounts, and explicit CPU/memory resource limits.</w:t>
+      </w:r>
+    </w:p>
+    <w:p>
+      <w:pPr>
+        <w:pStyle w:val="Heading2"/>
+      </w:pPr>
+      <w:r>
+        <w:t>17.5 Automated Daily Database Backups &amp; Lifecycle Management</w:t>
+      </w:r>
+    </w:p>
+    <w:p>
+      <w:r>
+        <w:t>To ensure business continuity and recovery from catastrophic hardware failure, the production topology includes a dedicated backup container running automated periodic pg_dump snapshots. Dumps are compressed with gzip and written to a dedicated pulse_backups persistent volume, with automated pruning of snapshots exceeding 14 days of retention.</w:t>
       </w:r>
     </w:p>
     <w:sectPr>

</xml_diff>